<commit_message>
feat: implement universal HR document generator and dynamic settings
- Replaced contract generator with universal document engine supporting 8 form types
- Added dedicated 'HR Forms' tab to Staff Profile Modal
- Implemented smart automated document prompts for promotions and offboarding
- Upgraded number translation utility to support million-tier salaries
- Created RoleDescriptionsSettings for dynamic job descriptions
- Expanded company config settings to manage contract variables
- Fixed floating-point rounding bug for base salary inputs
</commit_message>
<xml_diff>
--- a/public/templates/contract_template.docx
+++ b/public/templates/contract_template.docx
@@ -10,25 +10,25 @@
           <w:rFonts w:ascii="Aptos" w:eastAsia="Aptos" w:hAnsi="Aptos" w:cs="Aptos"/>
           <w:b/>
           <w:bCs/>
-          <w:sz w:val="52"/>
-          <w:szCs w:val="52"/>
-        </w:rPr>
-      </w:pPr>
-      <w:r>
-        <w:rPr>
-          <w:rFonts w:ascii="Aptos" w:eastAsia="Aptos" w:hAnsi="Aptos" w:cs="Aptos"/>
-          <w:b/>
-          <w:bCs/>
-          <w:sz w:val="52"/>
-          <w:szCs w:val="52"/>
+          <w:sz w:val="40"/>
+          <w:szCs w:val="40"/>
+        </w:rPr>
+      </w:pPr>
+      <w:r>
+        <w:rPr>
+          <w:rFonts w:ascii="Aptos" w:eastAsia="Aptos" w:hAnsi="Aptos" w:cs="Aptos"/>
+          <w:b/>
+          <w:bCs/>
+          <w:sz w:val="40"/>
+          <w:szCs w:val="40"/>
         </w:rPr>
         <w:t>Employment Contract and Rules</w:t>
       </w:r>
       <w:r>
         <w:rPr>
           <w:rFonts w:ascii="Aptos" w:eastAsia="Aptos" w:hAnsi="Aptos" w:cs="Aptos"/>
-          <w:sz w:val="52"/>
-          <w:szCs w:val="52"/>
+          <w:sz w:val="40"/>
+          <w:szCs w:val="40"/>
         </w:rPr>
         <w:t xml:space="preserve"> </w:t>
       </w:r>
@@ -38,8 +38,8 @@
           <w:rFonts w:ascii="Aptos" w:eastAsia="Aptos" w:hAnsi="Aptos" w:cs="Aptos"/>
           <w:b/>
           <w:bCs/>
-          <w:sz w:val="52"/>
-          <w:szCs w:val="52"/>
+          <w:sz w:val="44"/>
+          <w:szCs w:val="44"/>
         </w:rPr>
         <w:t>สัญญาจ้างงานและระเบียบข้อบังคับเกี่ยวกับการทำงาน</w:t>
       </w:r>
@@ -82,21 +82,7 @@
         <w:rPr>
           <w:rFonts w:ascii="Aptos" w:eastAsia="Aptos" w:hAnsi="Aptos" w:cs="Aptos"/>
         </w:rPr>
-        <w:t xml:space="preserve"> เอกสารฉบับนี้ถือเป็นทั้งสัญญาจ้างงานและระเบียบข้อบังคับการทำงานที่ครอบคลุมเงื่อนไขการจ้างงานและความประพฤติ</w:t>
-      </w:r>
-      <w:proofErr w:type="spellStart"/>
-      <w:r>
-        <w:rPr>
-          <w:rFonts w:ascii="Aptos" w:eastAsia="Aptos" w:hAnsi="Aptos" w:cs="Aptos"/>
-        </w:rPr>
-        <w:t>ที่คาดหวังสำหรับพนักงานทุกคนของ</w:t>
-      </w:r>
-      <w:proofErr w:type="spellEnd"/>
-      <w:r>
-        <w:rPr>
-          <w:rFonts w:ascii="Aptos" w:eastAsia="Aptos" w:hAnsi="Aptos" w:cs="Aptos"/>
-        </w:rPr>
-        <w:t xml:space="preserve"> </w:t>
+        <w:t xml:space="preserve"> เอกสารฉบับนี้ถือเป็นทั้งสัญญาจ้างงานและระเบียบข้อบังคับการทำงานที่ครอบคลุมเงื่อนไขการจ้างงานและความประพฤติที่คาดหวังสำหรับพนักงานทุกคนของ </w:t>
       </w:r>
       <w:proofErr w:type="spellStart"/>
       <w:r>
@@ -545,37 +531,31 @@
           <w:b/>
           <w:bCs/>
         </w:rPr>
-        <w:t xml:space="preserve">Start Date / </w:t>
-      </w:r>
-      <w:proofErr w:type="spellStart"/>
-      <w:r>
-        <w:rPr>
-          <w:rFonts w:ascii="Aptos" w:eastAsia="Aptos" w:hAnsi="Aptos" w:cs="Aptos"/>
-          <w:b/>
-          <w:bCs/>
-        </w:rPr>
-        <w:t>วันเริ่มงาน</w:t>
-      </w:r>
-      <w:proofErr w:type="spellEnd"/>
-      <w:r>
-        <w:rPr>
-          <w:rFonts w:ascii="Aptos" w:eastAsia="Aptos" w:hAnsi="Aptos" w:cs="Aptos"/>
-          <w:b/>
-          <w:bCs/>
-        </w:rPr>
-        <w:t>:</w:t>
-      </w:r>
-      <w:r>
-        <w:rPr>
-          <w:rFonts w:ascii="Aptos" w:eastAsia="Aptos" w:hAnsi="Aptos" w:cs="Aptos"/>
-        </w:rPr>
-        <w:t xml:space="preserve"> </w:t>
-      </w:r>
-      <w:r>
-        <w:rPr>
-          <w:rFonts w:ascii="Aptos" w:eastAsia="Aptos" w:hAnsi="Aptos" w:cs="Aptos"/>
-        </w:rPr>
-        <w:t>{{START_DATE}}</w:t>
+        <w:t xml:space="preserve">Responsibilities / </w:t>
+      </w:r>
+      <w:proofErr w:type="spellStart"/>
+      <w:r>
+        <w:rPr>
+          <w:rFonts w:ascii="Browallia New" w:eastAsia="Aptos" w:hAnsi="Browallia New" w:cs="Browallia New"/>
+          <w:b/>
+          <w:bCs/>
+        </w:rPr>
+        <w:t>ความรับผิดชอบ</w:t>
+      </w:r>
+      <w:proofErr w:type="spellEnd"/>
+      <w:r>
+        <w:rPr>
+          <w:rFonts w:ascii="Aptos" w:eastAsia="Aptos" w:hAnsi="Aptos" w:cs="Aptos"/>
+          <w:b/>
+          <w:bCs/>
+        </w:rPr>
+        <w:t xml:space="preserve">: </w:t>
+      </w:r>
+      <w:r>
+        <w:rPr>
+          <w:rFonts w:ascii="Aptos" w:eastAsia="Aptos" w:hAnsi="Aptos" w:cs="Aptos"/>
+        </w:rPr>
+        <w:t>{{ROLE_RESPONSIBILITIES}}</w:t>
       </w:r>
     </w:p>
     <w:p>
@@ -596,6 +576,57 @@
           <w:b/>
           <w:bCs/>
         </w:rPr>
+        <w:t xml:space="preserve">Start Date / </w:t>
+      </w:r>
+      <w:proofErr w:type="spellStart"/>
+      <w:r>
+        <w:rPr>
+          <w:rFonts w:ascii="Aptos" w:eastAsia="Aptos" w:hAnsi="Aptos" w:cs="Aptos"/>
+          <w:b/>
+          <w:bCs/>
+        </w:rPr>
+        <w:t>วันเริ่มงาน</w:t>
+      </w:r>
+      <w:proofErr w:type="spellEnd"/>
+      <w:r>
+        <w:rPr>
+          <w:rFonts w:ascii="Aptos" w:eastAsia="Aptos" w:hAnsi="Aptos" w:cs="Aptos"/>
+          <w:b/>
+          <w:bCs/>
+        </w:rPr>
+        <w:t>:</w:t>
+      </w:r>
+      <w:r>
+        <w:rPr>
+          <w:rFonts w:ascii="Aptos" w:eastAsia="Aptos" w:hAnsi="Aptos" w:cs="Aptos"/>
+        </w:rPr>
+        <w:t xml:space="preserve"> </w:t>
+      </w:r>
+      <w:r>
+        <w:rPr>
+          <w:rFonts w:ascii="Aptos" w:eastAsia="Aptos" w:hAnsi="Aptos" w:cs="Aptos"/>
+        </w:rPr>
+        <w:t>{{START_DATE}}</w:t>
+      </w:r>
+    </w:p>
+    <w:p>
+      <w:pPr>
+        <w:pStyle w:val="ListParagraph"/>
+        <w:numPr>
+          <w:ilvl w:val="0"/>
+          <w:numId w:val="22"/>
+        </w:numPr>
+        <w:spacing w:before="240" w:after="240"/>
+        <w:rPr>
+          <w:rFonts w:ascii="Aptos" w:eastAsia="Aptos" w:hAnsi="Aptos" w:cs="Aptos"/>
+        </w:rPr>
+      </w:pPr>
+      <w:r>
+        <w:rPr>
+          <w:rFonts w:ascii="Aptos" w:eastAsia="Aptos" w:hAnsi="Aptos" w:cs="Aptos"/>
+          <w:b/>
+          <w:bCs/>
+        </w:rPr>
         <w:t xml:space="preserve">Work Location / </w:t>
       </w:r>
       <w:proofErr w:type="spellStart"/>
@@ -1145,21 +1176,7 @@
         <w:rPr>
           <w:rFonts w:ascii="Aptos" w:eastAsia="Aptos" w:hAnsi="Aptos" w:cs="Aptos"/>
         </w:rPr>
-        <w:t xml:space="preserve"> ลูกจ้างมีสิทธิได้รับสวัสดิการตามที่</w:t>
-      </w:r>
-      <w:proofErr w:type="spellStart"/>
-      <w:r>
-        <w:rPr>
-          <w:rFonts w:ascii="Aptos" w:eastAsia="Aptos" w:hAnsi="Aptos" w:cs="Aptos"/>
-        </w:rPr>
-        <w:t>ระบุไว้ในนโยบายสวัสดิการของบริษัท</w:t>
-      </w:r>
-      <w:proofErr w:type="spellEnd"/>
-      <w:r>
-        <w:rPr>
-          <w:rFonts w:ascii="Aptos" w:eastAsia="Aptos" w:hAnsi="Aptos" w:cs="Aptos"/>
-        </w:rPr>
-        <w:t xml:space="preserve"> </w:t>
+        <w:t xml:space="preserve"> ลูกจ้างมีสิทธิได้รับสวัสดิการตามที่ระบุไว้ในนโยบายสวัสดิการของบริษัท </w:t>
       </w:r>
       <w:proofErr w:type="spellStart"/>
       <w:r>
@@ -1236,14 +1253,14 @@
         <w:rPr>
           <w:rFonts w:ascii="Aptos" w:eastAsia="Aptos" w:hAnsi="Aptos" w:cs="Aptos"/>
         </w:rPr>
-        <w:t xml:space="preserve"> paid annual leave days per year after completing one (1) full year of uninterrupted service. For employees who have not yet completed one year of service, annual leave will be granted on a pro-rata basis. ลูกจ้างมีสิทธิลาหยุดพักผ่อนประจำปี</w:t>
-      </w:r>
-      <w:proofErr w:type="spellStart"/>
-      <w:r>
-        <w:rPr>
-          <w:rFonts w:ascii="Aptos" w:eastAsia="Aptos" w:hAnsi="Aptos" w:cs="Aptos"/>
-        </w:rPr>
-        <w:t>โดยได้รับค่าจ้างอย่างน้อย</w:t>
+        <w:t xml:space="preserve"> paid annual leave days per year after completing one (1) full year of uninterrupted service. For employees who have not yet completed one year of service, annual leave will be granted on a pro-rata basis. ลูกจ้างมีสิทธิลาหยุดพักผ่อนประจำปีโดยได้รับค่าจ้างอย่าง</w:t>
+      </w:r>
+      <w:proofErr w:type="spellStart"/>
+      <w:r>
+        <w:rPr>
+          <w:rFonts w:ascii="Aptos" w:eastAsia="Aptos" w:hAnsi="Aptos" w:cs="Aptos"/>
+        </w:rPr>
+        <w:t>น้อย</w:t>
       </w:r>
       <w:proofErr w:type="spellEnd"/>
       <w:r>
@@ -1715,21 +1732,7 @@
         <w:rPr>
           <w:rFonts w:ascii="Aptos" w:eastAsia="Aptos" w:hAnsi="Aptos" w:cs="Aptos"/>
         </w:rPr>
-        <w:t xml:space="preserve"> discount per day. พนักงานมีสิทธิได้รับส่วนลดค่าอาหารหนึ่งมื้อและ</w:t>
-      </w:r>
-      <w:proofErr w:type="spellStart"/>
-      <w:r>
-        <w:rPr>
-          <w:rFonts w:ascii="Aptos" w:eastAsia="Aptos" w:hAnsi="Aptos" w:cs="Aptos"/>
-        </w:rPr>
-        <w:t>เครื่องดื่มหนึ่งแก้วในราคาลด</w:t>
-      </w:r>
-      <w:proofErr w:type="spellEnd"/>
-      <w:r>
-        <w:rPr>
-          <w:rFonts w:ascii="Aptos" w:eastAsia="Aptos" w:hAnsi="Aptos" w:cs="Aptos"/>
-        </w:rPr>
-        <w:t xml:space="preserve"> </w:t>
+        <w:t xml:space="preserve"> discount per day. พนักงานมีสิทธิได้รับส่วนลดค่าอาหารหนึ่งมื้อและเครื่องดื่มหนึ่งแก้วในราคาลด </w:t>
       </w:r>
       <w:r>
         <w:rPr>
@@ -2321,14 +2324,14 @@
         <w:rPr>
           <w:rFonts w:ascii="Aptos" w:eastAsia="Aptos" w:hAnsi="Aptos" w:cs="Aptos"/>
         </w:rPr>
-        <w:t>months. ลูกจ้างจะต้องผ่านระยะเวลา</w:t>
-      </w:r>
-      <w:proofErr w:type="spellStart"/>
-      <w:r>
-        <w:rPr>
-          <w:rFonts w:ascii="Aptos" w:eastAsia="Aptos" w:hAnsi="Aptos" w:cs="Aptos"/>
-        </w:rPr>
-        <w:t>ทดลองงานเป็นเวลาสาม</w:t>
+        <w:t>months. ลูกจ้างจะต้องผ่านระยะเวลาทดลองงานเป็นเวลา</w:t>
+      </w:r>
+      <w:proofErr w:type="spellStart"/>
+      <w:r>
+        <w:rPr>
+          <w:rFonts w:ascii="Aptos" w:eastAsia="Aptos" w:hAnsi="Aptos" w:cs="Aptos"/>
+        </w:rPr>
+        <w:t>สาม</w:t>
       </w:r>
       <w:proofErr w:type="spellEnd"/>
       <w:r>
@@ -2424,14 +2427,14 @@
         <w:rPr>
           <w:rFonts w:ascii="Aptos" w:eastAsia="Aptos" w:hAnsi="Aptos" w:cs="Aptos"/>
         </w:rPr>
-        <w:t xml:space="preserve"> Employment may be terminated by either party with thirty (30) days written notice, subject to the provisions of Thai labor law. การจ้างงานอาจถูกยกเลิกโดยฝ่ายใดฝ่ายหนึ่งด้วยการแจ้ง</w:t>
-      </w:r>
-      <w:proofErr w:type="spellStart"/>
-      <w:r>
-        <w:rPr>
-          <w:rFonts w:ascii="Aptos" w:eastAsia="Aptos" w:hAnsi="Aptos" w:cs="Aptos"/>
-        </w:rPr>
-        <w:t>เป็นลายลักษณ์อักษรล่วงหน้าสามสิบ</w:t>
+        <w:t xml:space="preserve"> Employment may be terminated by either party with thirty (30) days written notice, subject to the provisions of Thai labor law. การจ้างงานอาจถูกยกเลิก</w:t>
+      </w:r>
+      <w:proofErr w:type="spellStart"/>
+      <w:r>
+        <w:rPr>
+          <w:rFonts w:ascii="Aptos" w:eastAsia="Aptos" w:hAnsi="Aptos" w:cs="Aptos"/>
+        </w:rPr>
+        <w:t>โดยฝ่ายใดฝ่ายหนึ่งด้วยการแจ้งเป็นลายลักษณ์อักษรล่วงหน้าสามสิบ</w:t>
       </w:r>
       <w:proofErr w:type="spellEnd"/>
       <w:r>
@@ -2637,14 +2640,14 @@
         <w:rPr>
           <w:rFonts w:ascii="Aptos" w:eastAsia="Aptos" w:hAnsi="Aptos" w:cs="Aptos"/>
         </w:rPr>
-        <w:t xml:space="preserve"> กฎระเบียบและแนวทางปฏิบัติที่ระบุไว้ในภาคผนวกของเอกสารฉบับนี้ถือเป็น</w:t>
-      </w:r>
-      <w:proofErr w:type="spellStart"/>
-      <w:r>
-        <w:rPr>
-          <w:rFonts w:ascii="Aptos" w:eastAsia="Aptos" w:hAnsi="Aptos" w:cs="Aptos"/>
-        </w:rPr>
-        <w:t>ส่วนสำคัญของข้อกำหนดการจ้างงาน</w:t>
+        <w:t xml:space="preserve"> กฎระเบียบและแนวทางปฏิบัติที่ระบุไว้</w:t>
+      </w:r>
+      <w:proofErr w:type="spellStart"/>
+      <w:r>
+        <w:rPr>
+          <w:rFonts w:ascii="Aptos" w:eastAsia="Aptos" w:hAnsi="Aptos" w:cs="Aptos"/>
+        </w:rPr>
+        <w:t>ในภาคผนวกของเอกสารฉบับนี้ถือเป็นส่วนสำคัญของข้อกำหนดการจ้างงาน</w:t>
       </w:r>
       <w:proofErr w:type="spellEnd"/>
       <w:r>
@@ -2733,7 +2736,7 @@
           <w:b/>
           <w:bCs/>
         </w:rPr>
-        <w:t>{{TRADING_NAME}}</w:t>
+        <w:t>{{COMPANY_LEGAL_NAME}}</w:t>
       </w:r>
       <w:r>
         <w:rPr>
@@ -2749,7 +2752,7 @@
           <w:b/>
           <w:bCs/>
         </w:rPr>
-        <w:t>{{TRADING_NAME}}</w:t>
+        <w:t>{{COMPANY_LEGAL_NAME}}</w:t>
       </w:r>
       <w:r>
         <w:rPr>
@@ -2783,7 +2786,7 @@
         <w:rPr>
           <w:rFonts w:ascii="Aptos" w:eastAsia="Aptos" w:hAnsi="Aptos" w:cs="Aptos"/>
         </w:rPr>
-        <w:t>{{TRADING_NAME}}</w:t>
+        <w:t>{{COMPANY_LEGAL_NAME}}</w:t>
       </w:r>
       <w:r>
         <w:rPr>
@@ -2837,7 +2840,7 @@
         <w:rPr>
           <w:rFonts w:ascii="Aptos" w:eastAsia="Aptos" w:hAnsi="Aptos" w:cs="Aptos"/>
         </w:rPr>
-        <w:t>{{TRADING_NAME}}</w:t>
+        <w:t>{{COMPANY_LEGAL_NAME}}</w:t>
       </w:r>
       <w:r>
         <w:rPr>
@@ -3345,16 +3348,8 @@
         <w:rPr>
           <w:rFonts w:ascii="Aptos" w:eastAsia="Aptos" w:hAnsi="Aptos" w:cs="Aptos"/>
         </w:rPr>
-        <w:t xml:space="preserve"> uniforms are provided to each employee free of charge. มีการจัดหาชุดยูนิฟอร์มให้พนักงาน</w:t>
-      </w:r>
-      <w:proofErr w:type="spellStart"/>
-      <w:r>
-        <w:rPr>
-          <w:rFonts w:ascii="Aptos" w:eastAsia="Aptos" w:hAnsi="Aptos" w:cs="Aptos"/>
-        </w:rPr>
-        <w:t>แต่ละคนฟรีจำนวน</w:t>
-      </w:r>
-      <w:proofErr w:type="spellEnd"/>
+        <w:t xml:space="preserve"> uniforms are provided to each employee free of charge. มีการจัดหาชุดยูนิฟอร์มให้พนักงานแต่ละคนฟรีจำนวน</w:t>
+      </w:r>
       <w:r>
         <w:rPr>
           <w:rFonts w:ascii="Aptos" w:eastAsia="Aptos" w:hAnsi="Aptos" w:cs="Aptos"/>
@@ -3632,21 +3627,7 @@
         <w:rPr>
           <w:rFonts w:ascii="Aptos" w:eastAsia="Aptos" w:hAnsi="Aptos" w:cs="Aptos"/>
         </w:rPr>
-        <w:t xml:space="preserve"> If an employee requests an additional uniform for reasons other than those stated above (e.g., personal preference, lost shirt), the employee will be charged a specified fee, which will be deducted from their salary. หากพนักงานร้องขอชุดเพิ่มเติมด้วย</w:t>
-      </w:r>
-      <w:proofErr w:type="spellStart"/>
-      <w:r>
-        <w:rPr>
-          <w:rFonts w:ascii="Aptos" w:eastAsia="Aptos" w:hAnsi="Aptos" w:cs="Aptos"/>
-        </w:rPr>
-        <w:t>เหตุผลอื่นนอกเหนือจากที่ระบุข้างต้น</w:t>
-      </w:r>
-      <w:proofErr w:type="spellEnd"/>
-      <w:r>
-        <w:rPr>
-          <w:rFonts w:ascii="Aptos" w:eastAsia="Aptos" w:hAnsi="Aptos" w:cs="Aptos"/>
-        </w:rPr>
-        <w:t xml:space="preserve"> (</w:t>
+        <w:t xml:space="preserve"> If an employee requests an additional uniform for reasons other than those stated above (e.g., personal preference, lost shirt), the employee will be charged a specified fee, which will be deducted from their salary. หากพนักงานร้องขอชุดเพิ่มเติมด้วยเหตุผลอื่นนอกเหนือจากที่ระบุข้างต้น (</w:t>
       </w:r>
       <w:proofErr w:type="spellStart"/>
       <w:r>
@@ -3977,7 +3958,7 @@
         <w:rPr>
           <w:rFonts w:ascii="Aptos" w:eastAsia="Aptos" w:hAnsi="Aptos" w:cs="Aptos"/>
         </w:rPr>
-        <w:t>{{TRADING_NAME}}</w:t>
+        <w:t>{{COMPANY_LEGAL_NAME}}</w:t>
       </w:r>
       <w:r>
         <w:rPr>
@@ -4017,7 +3998,7 @@
         <w:rPr>
           <w:rFonts w:ascii="Aptos" w:eastAsia="Aptos" w:hAnsi="Aptos" w:cs="Aptos"/>
         </w:rPr>
-        <w:t>{{TRADING_NAME}}</w:t>
+        <w:t>{{COMPANY_LEGAL_NAME}}</w:t>
       </w:r>
       <w:r>
         <w:rPr>
@@ -4288,7 +4269,7 @@
         <w:rPr>
           <w:rFonts w:ascii="Aptos" w:eastAsia="Aptos" w:hAnsi="Aptos" w:cs="Aptos"/>
         </w:rPr>
-        <w:t>{{TRADING_NAME}}</w:t>
+        <w:t>{{COMPANY_LEGAL_NAME}}</w:t>
       </w:r>
       <w:r>
         <w:rPr>
@@ -4328,7 +4309,7 @@
         <w:rPr>
           <w:rFonts w:ascii="Aptos" w:eastAsia="Aptos" w:hAnsi="Aptos" w:cs="Aptos"/>
         </w:rPr>
-        <w:t>{{TRADING_NAME}}</w:t>
+        <w:t>{{COMPANY_LEGAL_NAME}}</w:t>
       </w:r>
       <w:r>
         <w:rPr>
@@ -5537,40 +5518,26 @@
         <w:rPr>
           <w:rFonts w:ascii="Aptos" w:eastAsia="Aptos" w:hAnsi="Aptos" w:cs="Aptos"/>
         </w:rPr>
-        <w:t>{{TRADING_NAME}}</w:t>
-      </w:r>
-      <w:r>
-        <w:rPr>
-          <w:rFonts w:ascii="Aptos" w:eastAsia="Aptos" w:hAnsi="Aptos" w:cs="Aptos"/>
-        </w:rPr>
-        <w:t xml:space="preserve">'s operational needs. Employees will be notified of any </w:t>
+        <w:t>{{COMPANY_LEGAL_NAME}}</w:t>
+      </w:r>
+      <w:r>
+        <w:rPr>
+          <w:rFonts w:ascii="Aptos" w:eastAsia="Aptos" w:hAnsi="Aptos" w:cs="Aptos"/>
+        </w:rPr>
+        <w:t xml:space="preserve">'s operational needs. Employees will be </w:t>
       </w:r>
       <w:r>
         <w:rPr>
           <w:rFonts w:ascii="Aptos" w:eastAsia="Aptos" w:hAnsi="Aptos" w:cs="Aptos"/>
         </w:rPr>
         <w:lastRenderedPageBreak/>
-        <w:t>changes in a timely manner. นโยบายระเบียบการแต่งกายนี้อาจมีการปรับปรุงเป็นระยะเพื่อสะท้อนถึงการเปลี่ยนแปลงในมาตรฐานอุตสาหกรรมหรือ</w:t>
-      </w:r>
-      <w:proofErr w:type="spellStart"/>
-      <w:r>
-        <w:rPr>
-          <w:rFonts w:ascii="Aptos" w:eastAsia="Aptos" w:hAnsi="Aptos" w:cs="Aptos"/>
-        </w:rPr>
-        <w:t>ความต้องการในการดำเนินงานของ</w:t>
-      </w:r>
-      <w:proofErr w:type="spellEnd"/>
-      <w:r>
-        <w:rPr>
-          <w:rFonts w:ascii="Aptos" w:eastAsia="Aptos" w:hAnsi="Aptos" w:cs="Aptos"/>
-        </w:rPr>
-        <w:t xml:space="preserve"> </w:t>
-      </w:r>
-      <w:r>
-        <w:rPr>
-          <w:rFonts w:ascii="Aptos" w:eastAsia="Aptos" w:hAnsi="Aptos" w:cs="Aptos"/>
-        </w:rPr>
-        <w:t>{{TRADING_NAME}}</w:t>
+        <w:t xml:space="preserve">notified of any changes in a timely manner. นโยบายระเบียบการแต่งกายนี้อาจมีการปรับปรุงเป็นระยะเพื่อสะท้อนถึงการเปลี่ยนแปลงในมาตรฐานอุตสาหกรรมหรือความต้องการในการดำเนินงานของ </w:t>
+      </w:r>
+      <w:r>
+        <w:rPr>
+          <w:rFonts w:ascii="Aptos" w:eastAsia="Aptos" w:hAnsi="Aptos" w:cs="Aptos"/>
+        </w:rPr>
+        <w:t>{{COMPANY_LEGAL_NAME}}</w:t>
       </w:r>
       <w:r>
         <w:rPr>
@@ -5672,7 +5639,7 @@
           <w:b/>
           <w:bCs/>
         </w:rPr>
-        <w:t>{{TRADING_NAME}}</w:t>
+        <w:t>{{COMPANY_LEGAL_NAME}}</w:t>
       </w:r>
       <w:r>
         <w:rPr>
@@ -5686,14 +5653,14 @@
         <w:rPr>
           <w:rFonts w:ascii="Aptos" w:eastAsia="Aptos" w:hAnsi="Aptos" w:cs="Aptos"/>
         </w:rPr>
-        <w:t xml:space="preserve"> นโยบายนี้ระบุกฎทั่วไปและความคาดหวังเกี่ยวกับการเข้างานและการตรงต่อ</w:t>
-      </w:r>
-      <w:proofErr w:type="spellStart"/>
-      <w:r>
-        <w:rPr>
-          <w:rFonts w:ascii="Aptos" w:eastAsia="Aptos" w:hAnsi="Aptos" w:cs="Aptos"/>
-        </w:rPr>
-        <w:t>เวลาสำหรับพนักงานทุกคนของ</w:t>
+        <w:t xml:space="preserve"> นโยบายนี้ระบุกฎทั่วไปและความคาดหวัง</w:t>
+      </w:r>
+      <w:proofErr w:type="spellStart"/>
+      <w:r>
+        <w:rPr>
+          <w:rFonts w:ascii="Aptos" w:eastAsia="Aptos" w:hAnsi="Aptos" w:cs="Aptos"/>
+        </w:rPr>
+        <w:t>เกี่ยวกับการเข้างานและการตรงต่อเวลาสำหรับพนักงานทุกคนของ</w:t>
       </w:r>
       <w:proofErr w:type="spellEnd"/>
       <w:r>
@@ -5706,7 +5673,7 @@
         <w:rPr>
           <w:rFonts w:ascii="Aptos" w:eastAsia="Aptos" w:hAnsi="Aptos" w:cs="Aptos"/>
         </w:rPr>
-        <w:t>{{TRADING_NAME}}</w:t>
+        <w:t>{{COMPANY_LEGAL_NAME}}</w:t>
       </w:r>
       <w:r>
         <w:rPr>
@@ -6270,14 +6237,14 @@
         <w:rPr>
           <w:rFonts w:ascii="Aptos" w:eastAsia="Aptos" w:hAnsi="Aptos" w:cs="Aptos"/>
         </w:rPr>
-        <w:t xml:space="preserve"> Any employee who anticipates being late must notify their immediate supervisor as soon as possible, providing a reason for the delay and an estimated time of arrival. Notification should be made via phone call or message (preferably by LINE application). Employees are also encouraged to notify their colleagues. พนักงานคนใดที่คาดว่าจะมาสายต้อง</w:t>
-      </w:r>
-      <w:proofErr w:type="spellStart"/>
-      <w:r>
-        <w:rPr>
-          <w:rFonts w:ascii="Aptos" w:eastAsia="Aptos" w:hAnsi="Aptos" w:cs="Aptos"/>
-        </w:rPr>
-        <w:t>แจ้งหัวหน้างานโดยตรงให้เร็วที่สุด</w:t>
+        <w:t xml:space="preserve"> Any employee who anticipates being late must notify their immediate supervisor as soon as possible, providing a reason for the delay and an estimated time of arrival. Notification should be made via phone call or message (preferably by LINE application). Employees are also encouraged to notify their colleagues. พนักงานคน</w:t>
+      </w:r>
+      <w:proofErr w:type="spellStart"/>
+      <w:r>
+        <w:rPr>
+          <w:rFonts w:ascii="Aptos" w:eastAsia="Aptos" w:hAnsi="Aptos" w:cs="Aptos"/>
+        </w:rPr>
+        <w:t>ใดที่คาดว่าจะมาสายต้องแจ้งหัวหน้างานโดยตรงให้เร็วที่สุด</w:t>
       </w:r>
       <w:proofErr w:type="spellEnd"/>
       <w:r>
@@ -6439,21 +6406,7 @@
         <w:rPr>
           <w:rFonts w:ascii="Aptos" w:eastAsia="Aptos" w:hAnsi="Aptos" w:cs="Aptos"/>
         </w:rPr>
-        <w:t xml:space="preserve"> Consistent or unexplained lateness can disrupt restaurant operations and negatively impact team efficiency. Repeated instances of lateness will be addressed through the following progressive disciplinary actions: การมาสายอย่างสม่ำเสมอหรือไม่มีคำอธิบายสามารถขัดขวางการดำเนินงานของร้านอาหาร</w:t>
-      </w:r>
-      <w:proofErr w:type="spellStart"/>
-      <w:r>
-        <w:rPr>
-          <w:rFonts w:ascii="Aptos" w:eastAsia="Aptos" w:hAnsi="Aptos" w:cs="Aptos"/>
-        </w:rPr>
-        <w:t>และส่งผลเสียต่อประสิทธิภาพของทีม</w:t>
-      </w:r>
-      <w:proofErr w:type="spellEnd"/>
-      <w:r>
-        <w:rPr>
-          <w:rFonts w:ascii="Aptos" w:eastAsia="Aptos" w:hAnsi="Aptos" w:cs="Aptos"/>
-        </w:rPr>
-        <w:t xml:space="preserve"> </w:t>
+        <w:t xml:space="preserve"> Consistent or unexplained lateness can disrupt restaurant operations and negatively impact team efficiency. Repeated instances of lateness will be addressed through the following progressive disciplinary actions: การมาสายอย่างสม่ำเสมอหรือไม่มีคำอธิบายสามารถขัดขวางการดำเนินงานของร้านอาหารและส่งผลเสียต่อประสิทธิภาพของทีม </w:t>
       </w:r>
       <w:proofErr w:type="spellStart"/>
       <w:r>
@@ -6727,21 +6680,7 @@
         <w:rPr>
           <w:rFonts w:ascii="Aptos" w:eastAsia="Aptos" w:hAnsi="Aptos" w:cs="Aptos"/>
         </w:rPr>
-        <w:t xml:space="preserve"> Continued disregard for the punctuality rules may result in further disciplinary action up to and including termination of employment, in accordance with Thai labor law. The management reserves the right to determine appropriate action for persistent lateness beyond the progressive steps. การเพิกเฉยต่อกฎการตรงต่อเวลาอย่างต่อเนื่องอาจส่งผลให้มีการดำเนินการ</w:t>
-      </w:r>
-      <w:proofErr w:type="spellStart"/>
-      <w:r>
-        <w:rPr>
-          <w:rFonts w:ascii="Aptos" w:eastAsia="Aptos" w:hAnsi="Aptos" w:cs="Aptos"/>
-        </w:rPr>
-        <w:t>ทางวินัยเพิ่มเติมจนถึงขั้นเลิกจ้าง</w:t>
-      </w:r>
-      <w:proofErr w:type="spellEnd"/>
-      <w:r>
-        <w:rPr>
-          <w:rFonts w:ascii="Aptos" w:eastAsia="Aptos" w:hAnsi="Aptos" w:cs="Aptos"/>
-        </w:rPr>
-        <w:t xml:space="preserve"> </w:t>
+        <w:t xml:space="preserve"> Continued disregard for the punctuality rules may result in further disciplinary action up to and including termination of employment, in accordance with Thai labor law. The management reserves the right to determine appropriate action for persistent lateness beyond the progressive steps. การเพิกเฉยต่อกฎการตรงต่อเวลาอย่างต่อเนื่องอาจส่งผลให้มีการดำเนินการทางวินัยเพิ่มเติมจนถึงขั้นเลิกจ้าง </w:t>
       </w:r>
       <w:proofErr w:type="spellStart"/>
       <w:r>
@@ -6830,21 +6769,7 @@
         <w:rPr>
           <w:rFonts w:ascii="Aptos" w:eastAsia="Aptos" w:hAnsi="Aptos" w:cs="Aptos"/>
         </w:rPr>
-        <w:t xml:space="preserve"> If an employee is unable to come to work due to illness or any other unavoidable reason, they must notify their immediate supervisor as soon as possible, preferably at least one hour before their scheduled start time. หากพนักงานไม่สามารถมาทำงานได้เนื่องจากการเจ็บป่วย</w:t>
-      </w:r>
-      <w:proofErr w:type="spellStart"/>
-      <w:r>
-        <w:rPr>
-          <w:rFonts w:ascii="Aptos" w:eastAsia="Aptos" w:hAnsi="Aptos" w:cs="Aptos"/>
-        </w:rPr>
-        <w:t>หรือเหตุผลที่หลีกเลี่ยงไม่ได้อื่นใด</w:t>
-      </w:r>
-      <w:proofErr w:type="spellEnd"/>
-      <w:r>
-        <w:rPr>
-          <w:rFonts w:ascii="Aptos" w:eastAsia="Aptos" w:hAnsi="Aptos" w:cs="Aptos"/>
-        </w:rPr>
-        <w:t xml:space="preserve"> </w:t>
+        <w:t xml:space="preserve"> If an employee is unable to come to work due to illness or any other unavoidable reason, they must notify their immediate supervisor as soon as possible, preferably at least one hour before their scheduled start time. หากพนักงานไม่สามารถมาทำงานได้เนื่องจากการเจ็บป่วยหรือเหตุผลที่หลีกเลี่ยงไม่ได้อื่นใด </w:t>
       </w:r>
       <w:proofErr w:type="spellStart"/>
       <w:r>
@@ -7371,7 +7296,7 @@
           <w:b/>
           <w:bCs/>
         </w:rPr>
-        <w:t>{{TRADING_NAME}}</w:t>
+        <w:t>{{COMPANY_LEGAL_NAME}}</w:t>
       </w:r>
       <w:r>
         <w:rPr>
@@ -7405,7 +7330,7 @@
         <w:rPr>
           <w:rFonts w:ascii="Aptos" w:eastAsia="Aptos" w:hAnsi="Aptos" w:cs="Aptos"/>
         </w:rPr>
-        <w:t>{{TRADING_NAME}}</w:t>
+        <w:t>{{COMPANY_LEGAL_NAME}}</w:t>
       </w:r>
       <w:r>
         <w:rPr>
@@ -7506,7 +7431,7 @@
         <w:rPr>
           <w:rFonts w:ascii="Aptos" w:eastAsia="Aptos" w:hAnsi="Aptos" w:cs="Aptos"/>
         </w:rPr>
-        <w:t>{{TRADING_NAME}}</w:t>
+        <w:t>{{COMPANY_LEGAL_NAME}}</w:t>
       </w:r>
       <w:r>
         <w:rPr>
@@ -7544,7 +7469,7 @@
         <w:rPr>
           <w:rFonts w:ascii="Aptos" w:eastAsia="Aptos" w:hAnsi="Aptos" w:cs="Aptos"/>
         </w:rPr>
-        <w:t>{{TRADING_NAME}}</w:t>
+        <w:t>{{COMPANY_LEGAL_NAME}}</w:t>
       </w:r>
       <w:r>
         <w:rPr>
@@ -8065,6 +7990,24 @@
           <w:rFonts w:ascii="Aptos" w:eastAsia="Aptos" w:hAnsi="Aptos" w:cs="Aptos"/>
         </w:rPr>
       </w:pPr>
+      <w:r>
+        <w:rPr>
+          <w:rFonts w:ascii="Aptos" w:eastAsia="Aptos" w:hAnsi="Aptos" w:cs="Aptos"/>
+          <w:b/>
+          <w:bCs/>
+          <w:color w:val="1B1C1D"/>
+        </w:rPr>
+        <w:t>Date: ____________________</w:t>
+      </w:r>
+      <w:r>
+        <w:rPr>
+          <w:rFonts w:ascii="Aptos" w:eastAsia="Aptos" w:hAnsi="Aptos" w:cs="Aptos"/>
+          <w:b/>
+          <w:bCs/>
+          <w:color w:val="1B1C1D"/>
+        </w:rPr>
+        <w:tab/>
+      </w:r>
     </w:p>
     <w:p>
       <w:pPr>
@@ -8073,31 +8016,59 @@
           <w:rFonts w:ascii="Aptos" w:eastAsia="Aptos" w:hAnsi="Aptos" w:cs="Aptos"/>
           <w:b/>
           <w:bCs/>
-        </w:rPr>
-      </w:pPr>
-      <w:r>
-        <w:rPr>
-          <w:rFonts w:ascii="Aptos" w:eastAsia="Aptos" w:hAnsi="Aptos" w:cs="Aptos"/>
-          <w:b/>
-          <w:bCs/>
-        </w:rPr>
-        <w:t>Employee:</w:t>
-      </w:r>
-    </w:p>
-    <w:p>
-      <w:pPr>
-        <w:spacing w:after="240" w:line="276" w:lineRule="auto"/>
-        <w:rPr>
-          <w:rFonts w:ascii="Aptos" w:eastAsia="Aptos" w:hAnsi="Aptos" w:cs="Aptos"/>
           <w:color w:val="1B1C1D"/>
         </w:rPr>
       </w:pPr>
       <w:r>
         <w:rPr>
           <w:rFonts w:ascii="Aptos" w:eastAsia="Aptos" w:hAnsi="Aptos" w:cs="Aptos"/>
+          <w:b/>
+          <w:bCs/>
+        </w:rPr>
+        <w:t>Employee</w:t>
+      </w:r>
+      <w:r>
+        <w:rPr>
+          <w:rFonts w:ascii="Aptos" w:eastAsia="Aptos" w:hAnsi="Aptos" w:cs="Aptos"/>
+          <w:b/>
+          <w:bCs/>
+        </w:rPr>
+        <w:br/>
+      </w:r>
+      <w:r>
+        <w:rPr>
+          <w:rFonts w:ascii="Aptos" w:eastAsia="Aptos" w:hAnsi="Aptos" w:cs="Aptos"/>
+          <w:b/>
+          <w:bCs/>
+        </w:rPr>
+        <w:br/>
+      </w:r>
+      <w:proofErr w:type="spellStart"/>
+      <w:r>
+        <w:rPr>
+          <w:rFonts w:ascii="Aptos" w:eastAsia="Aptos" w:hAnsi="Aptos" w:cs="Aptos"/>
+          <w:b/>
+          <w:bCs/>
           <w:color w:val="1B1C1D"/>
         </w:rPr>
-        <w:t xml:space="preserve">Employee Name: </w:t>
+        <w:t>Employee</w:t>
+      </w:r>
+      <w:proofErr w:type="spellEnd"/>
+      <w:r>
+        <w:rPr>
+          <w:rFonts w:ascii="Aptos" w:eastAsia="Aptos" w:hAnsi="Aptos" w:cs="Aptos"/>
+          <w:b/>
+          <w:bCs/>
+          <w:color w:val="1B1C1D"/>
+        </w:rPr>
+        <w:t xml:space="preserve"> Name:</w:t>
+      </w:r>
+      <w:r>
+        <w:rPr>
+          <w:rFonts w:ascii="Aptos" w:eastAsia="Aptos" w:hAnsi="Aptos" w:cs="Aptos"/>
+          <w:color w:val="1B1C1D"/>
+        </w:rPr>
+        <w:t xml:space="preserve"> </w:t>
       </w:r>
       <w:r>
         <w:rPr>
@@ -8115,14 +8086,28 @@
         <w:rPr>
           <w:rFonts w:ascii="Aptos" w:eastAsia="Aptos" w:hAnsi="Aptos" w:cs="Aptos"/>
         </w:rPr>
-        <w:tab/>
-      </w:r>
-      <w:r>
-        <w:rPr>
-          <w:rFonts w:ascii="Aptos" w:eastAsia="Aptos" w:hAnsi="Aptos" w:cs="Aptos"/>
+        <w:br/>
+      </w:r>
+      <w:r>
+        <w:rPr>
+          <w:rFonts w:ascii="Aptos" w:eastAsia="Aptos" w:hAnsi="Aptos" w:cs="Aptos"/>
+          <w:b/>
+          <w:bCs/>
           <w:color w:val="1B1C1D"/>
         </w:rPr>
-        <w:t>Employee Signature: ____________________</w:t>
+        <w:t>Employee Signature</w:t>
+      </w:r>
+      <w:r>
+        <w:rPr>
+          <w:rFonts w:ascii="Aptos" w:eastAsia="Aptos" w:hAnsi="Aptos" w:cs="Aptos"/>
+          <w:b/>
+          <w:bCs/>
+          <w:color w:val="1B1C1D"/>
+        </w:rPr>
+        <w:t>:</w:t>
+      </w:r>
+      <w:r>
+        <w:t xml:space="preserve"> </w:t>
       </w:r>
       <w:r>
         <w:br/>
@@ -8167,19 +8152,17 @@
           <w:bCs/>
           <w:color w:val="1B1C1D"/>
         </w:rPr>
-        <w:t>):</w:t>
-      </w:r>
-    </w:p>
-    <w:p>
-      <w:pPr>
-        <w:spacing w:after="240" w:line="276" w:lineRule="auto"/>
+        <w:t>)</w:t>
+      </w:r>
+      <w:r>
         <w:rPr>
           <w:rFonts w:ascii="Aptos" w:eastAsia="Aptos" w:hAnsi="Aptos" w:cs="Aptos"/>
           <w:b/>
           <w:bCs/>
           <w:color w:val="1B1C1D"/>
         </w:rPr>
-      </w:pPr>
+        <w:t xml:space="preserve">, </w:t>
+      </w:r>
       <w:r>
         <w:rPr>
           <w:rFonts w:ascii="Aptos" w:eastAsia="Aptos" w:hAnsi="Aptos" w:cs="Aptos"/>
@@ -8189,28 +8172,24 @@
         </w:rPr>
         <w:t>Represented by:</w:t>
       </w:r>
-    </w:p>
-    <w:p>
-      <w:pPr>
-        <w:spacing w:after="240" w:line="276" w:lineRule="auto"/>
+      <w:r>
         <w:rPr>
           <w:rFonts w:ascii="Aptos" w:eastAsia="Aptos" w:hAnsi="Aptos" w:cs="Aptos"/>
           <w:b/>
           <w:bCs/>
           <w:color w:val="1B1C1D"/>
         </w:rPr>
-      </w:pPr>
-    </w:p>
-    <w:p>
-      <w:pPr>
-        <w:spacing w:after="240" w:line="276" w:lineRule="auto"/>
+        <w:br/>
+      </w:r>
+      <w:r>
         <w:rPr>
           <w:rFonts w:ascii="Aptos" w:eastAsia="Aptos" w:hAnsi="Aptos" w:cs="Aptos"/>
           <w:b/>
           <w:bCs/>
           <w:color w:val="1B1C1D"/>
         </w:rPr>
-      </w:pPr>
+        <w:t>{{#DIRECTORS}}</w:t>
+      </w:r>
       <w:r>
         <w:rPr>
           <w:rFonts w:ascii="Aptos" w:eastAsia="Aptos" w:hAnsi="Aptos" w:cs="Aptos"/>
@@ -8218,34 +8197,33 @@
           <w:bCs/>
           <w:color w:val="1B1C1D"/>
         </w:rPr>
-        <w:t>{{#DIRECTORS}}</w:t>
-      </w:r>
-    </w:p>
-    <w:p>
-      <w:pPr>
-        <w:spacing w:after="240" w:line="276" w:lineRule="auto"/>
+        <w:br/>
+      </w:r>
+      <w:r>
         <w:rPr>
           <w:rFonts w:ascii="Aptos" w:eastAsia="Aptos" w:hAnsi="Aptos" w:cs="Aptos"/>
           <w:b/>
           <w:bCs/>
           <w:color w:val="1B1C1D"/>
         </w:rPr>
-      </w:pPr>
-      <w:r>
-        <w:rPr>
-          <w:rFonts w:ascii="Aptos" w:eastAsia="Aptos" w:hAnsi="Aptos" w:cs="Aptos"/>
-          <w:b/>
-          <w:bCs/>
+        <w:lastRenderedPageBreak/>
+        <w:t xml:space="preserve">Director Name: </w:t>
+      </w:r>
+      <w:r>
+        <w:rPr>
+          <w:rFonts w:ascii="Aptos" w:eastAsia="Aptos" w:hAnsi="Aptos" w:cs="Aptos"/>
           <w:color w:val="1B1C1D"/>
         </w:rPr>
-        <w:t xml:space="preserve">Director Name: </w:t>
-      </w:r>
-      <w:r>
-        <w:rPr>
-          <w:rFonts w:ascii="Aptos" w:eastAsia="Aptos" w:hAnsi="Aptos" w:cs="Aptos"/>
+        <w:t>{{NAME}}</w:t>
+      </w:r>
+      <w:r>
+        <w:rPr>
+          <w:rFonts w:ascii="Aptos" w:eastAsia="Aptos" w:hAnsi="Aptos" w:cs="Aptos"/>
+          <w:b/>
+          <w:bCs/>
           <w:color w:val="1B1C1D"/>
         </w:rPr>
-        <w:t>{{NAME}}</w:t>
+        <w:br/>
       </w:r>
       <w:r>
         <w:rPr>
@@ -8254,7 +8232,16 @@
           <w:bCs/>
           <w:color w:val="1B1C1D"/>
         </w:rPr>
-        <w:tab/>
+        <w:t>Director Signature:</w:t>
+      </w:r>
+      <w:r>
+        <w:t xml:space="preserve"> </w:t>
+      </w:r>
+      <w:r>
+        <w:br/>
+      </w:r>
+      <w:r>
+        <w:br/>
       </w:r>
       <w:r>
         <w:rPr>
@@ -8263,123 +8250,7 @@
           <w:bCs/>
           <w:color w:val="1B1C1D"/>
         </w:rPr>
-        <w:tab/>
-      </w:r>
-      <w:r>
-        <w:rPr>
-          <w:rFonts w:ascii="Aptos" w:eastAsia="Aptos" w:hAnsi="Aptos" w:cs="Aptos"/>
-          <w:b/>
-          <w:bCs/>
-          <w:color w:val="1B1C1D"/>
-        </w:rPr>
-        <w:t>Director Signature: ____________________</w:t>
-      </w:r>
-    </w:p>
-    <w:p>
-      <w:pPr>
-        <w:spacing w:after="240" w:line="276" w:lineRule="auto"/>
-        <w:rPr>
-          <w:rFonts w:ascii="Aptos" w:eastAsia="Aptos" w:hAnsi="Aptos" w:cs="Aptos"/>
-          <w:b/>
-          <w:bCs/>
-          <w:color w:val="1B1C1D"/>
-        </w:rPr>
-      </w:pPr>
-    </w:p>
-    <w:p>
-      <w:pPr>
-        <w:spacing w:after="240" w:line="276" w:lineRule="auto"/>
-        <w:rPr>
-          <w:rFonts w:ascii="Aptos" w:eastAsia="Aptos" w:hAnsi="Aptos" w:cs="Aptos"/>
-          <w:b/>
-          <w:bCs/>
-          <w:color w:val="1B1C1D"/>
-        </w:rPr>
-      </w:pPr>
-      <w:r>
-        <w:rPr>
-          <w:rFonts w:ascii="Aptos" w:eastAsia="Aptos" w:hAnsi="Aptos" w:cs="Aptos"/>
-          <w:b/>
-          <w:bCs/>
-          <w:color w:val="1B1C1D"/>
-        </w:rPr>
         <w:t>{{/DIRECTORS}}</w:t>
-      </w:r>
-    </w:p>
-    <w:p>
-      <w:pPr>
-        <w:spacing w:after="240" w:line="276" w:lineRule="auto"/>
-        <w:rPr>
-          <w:rFonts w:ascii="Aptos" w:eastAsia="Aptos" w:hAnsi="Aptos" w:cs="Aptos"/>
-          <w:b/>
-          <w:bCs/>
-          <w:color w:val="1B1C1D"/>
-        </w:rPr>
-      </w:pPr>
-    </w:p>
-    <w:p>
-      <w:pPr>
-        <w:spacing w:after="240" w:line="276" w:lineRule="auto"/>
-        <w:rPr>
-          <w:rFonts w:ascii="Aptos" w:eastAsia="Aptos" w:hAnsi="Aptos" w:cs="Aptos"/>
-          <w:b/>
-          <w:bCs/>
-          <w:color w:val="1B1C1D"/>
-        </w:rPr>
-      </w:pPr>
-      <w:r>
-        <w:rPr>
-          <w:rFonts w:ascii="Aptos" w:eastAsia="Aptos" w:hAnsi="Aptos" w:cs="Aptos"/>
-          <w:b/>
-          <w:bCs/>
-          <w:color w:val="1B1C1D"/>
-        </w:rPr>
-        <w:t>Date: ____________________</w:t>
-      </w:r>
-      <w:r>
-        <w:rPr>
-          <w:rFonts w:ascii="Aptos" w:eastAsia="Aptos" w:hAnsi="Aptos" w:cs="Aptos"/>
-          <w:b/>
-          <w:bCs/>
-          <w:color w:val="1B1C1D"/>
-        </w:rPr>
-        <w:tab/>
-      </w:r>
-      <w:r>
-        <w:rPr>
-          <w:rFonts w:ascii="Aptos" w:eastAsia="Aptos" w:hAnsi="Aptos" w:cs="Aptos"/>
-          <w:b/>
-          <w:bCs/>
-          <w:color w:val="1B1C1D"/>
-        </w:rPr>
-        <w:tab/>
-      </w:r>
-      <w:r>
-        <w:rPr>
-          <w:rFonts w:ascii="Aptos" w:eastAsia="Aptos" w:hAnsi="Aptos" w:cs="Aptos"/>
-          <w:b/>
-          <w:bCs/>
-          <w:color w:val="1B1C1D"/>
-        </w:rPr>
-        <w:tab/>
-      </w:r>
-      <w:r>
-        <w:rPr>
-          <w:rFonts w:ascii="Aptos" w:eastAsia="Aptos" w:hAnsi="Aptos" w:cs="Aptos"/>
-          <w:b/>
-          <w:bCs/>
-          <w:color w:val="1B1C1D"/>
-        </w:rPr>
-        <w:tab/>
-      </w:r>
-      <w:r>
-        <w:rPr>
-          <w:rFonts w:ascii="Aptos" w:eastAsia="Aptos" w:hAnsi="Aptos" w:cs="Aptos"/>
-          <w:b/>
-          <w:bCs/>
-          <w:color w:val="1B1C1D"/>
-        </w:rPr>
-        <w:t>Company Seal:</w:t>
       </w:r>
     </w:p>
     <w:sectPr>
@@ -11696,7 +11567,6 @@
   <w:style w:type="character" w:default="1" w:styleId="DefaultParagraphFont">
     <w:name w:val="Default Paragraph Font"/>
     <w:uiPriority w:val="1"/>
-    <w:semiHidden/>
     <w:unhideWhenUsed/>
   </w:style>
   <w:style w:type="table" w:default="1" w:styleId="TableNormal">

</xml_diff>